<commit_message>
Completed Module 6 Movies Queries assignment
</commit_message>
<xml_diff>
--- a/Module-4/Richman-module-4.docx .docx
+++ b/Module-4/Richman-module-4.docx .docx
@@ -399,6 +399,68 @@
                     <a:xfrm>
                       <a:off x="0" y="0"/>
                       <a:ext cx="5943600" cy="5038090"/>
+                    </a:xfrm>
+                    <a:prstGeom prst="rect">
+                      <a:avLst/>
+                    </a:prstGeom>
+                  </pic:spPr>
+                </pic:pic>
+              </a:graphicData>
+            </a:graphic>
+          </wp:inline>
+        </w:drawing>
+      </w:r>
+    </w:p>
+    <w:p>
+      <w:pPr>
+        <w:rPr>
+          <w:rFonts w:ascii="Times New Roman" w:hAnsi="Times New Roman" w:cs="Times New Roman"/>
+        </w:rPr>
+      </w:pPr>
+    </w:p>
+    <w:p>
+      <w:pPr>
+        <w:rPr>
+          <w:rFonts w:ascii="Times New Roman" w:hAnsi="Times New Roman" w:cs="Times New Roman"/>
+        </w:rPr>
+      </w:pPr>
+      <w:r>
+        <w:rPr>
+          <w:rFonts w:ascii="Times New Roman" w:hAnsi="Times New Roman" w:cs="Times New Roman"/>
+          <w:noProof/>
+        </w:rPr>
+        <w:lastRenderedPageBreak/>
+        <w:drawing>
+          <wp:inline distT="0" distB="0" distL="0" distR="0" wp14:anchorId="64D00163" wp14:editId="4D0D8DA7">
+            <wp:extent cx="5943600" cy="3380740"/>
+            <wp:effectExtent l="0" t="0" r="0" b="0"/>
+            <wp:docPr id="1615280157" name="Picture 10"/>
+            <wp:cNvGraphicFramePr>
+              <a:graphicFrameLocks xmlns:a="http://schemas.openxmlformats.org/drawingml/2006/main" noChangeAspect="1"/>
+            </wp:cNvGraphicFramePr>
+            <a:graphic xmlns:a="http://schemas.openxmlformats.org/drawingml/2006/main">
+              <a:graphicData uri="http://schemas.openxmlformats.org/drawingml/2006/picture">
+                <pic:pic xmlns:pic="http://schemas.openxmlformats.org/drawingml/2006/picture">
+                  <pic:nvPicPr>
+                    <pic:cNvPr id="1615280157" name="Picture 1615280157"/>
+                    <pic:cNvPicPr/>
+                  </pic:nvPicPr>
+                  <pic:blipFill>
+                    <a:blip r:embed="rId11" cstate="print">
+                      <a:extLst>
+                        <a:ext uri="{28A0092B-C50C-407E-A947-70E740481C1C}">
+                          <a14:useLocalDpi xmlns:a14="http://schemas.microsoft.com/office/drawing/2010/main" val="0"/>
+                        </a:ext>
+                      </a:extLst>
+                    </a:blip>
+                    <a:stretch>
+                      <a:fillRect/>
+                    </a:stretch>
+                  </pic:blipFill>
+                  <pic:spPr>
+                    <a:xfrm>
+                      <a:off x="0" y="0"/>
+                      <a:ext cx="5943600" cy="3380740"/>
                     </a:xfrm>
                     <a:prstGeom prst="rect">
                       <a:avLst/>
@@ -1661,7 +1723,7 @@
 </file>
 
 <file path=customXml/itemProps1.xml><?xml version="1.0" encoding="utf-8"?>
-<ds:datastoreItem xmlns:ds="http://schemas.openxmlformats.org/officeDocument/2006/customXml" ds:itemID="{9D15EC2C-13B0-6D42-8332-B6B641314924}">
+<ds:datastoreItem xmlns:ds="http://schemas.openxmlformats.org/officeDocument/2006/customXml" ds:itemID="{3550BC1D-4B53-EE44-A209-9247CE014A86}">
   <ds:schemaRefs>
     <ds:schemaRef ds:uri="http://schemas.openxmlformats.org/officeDocument/2006/bibliography"/>
   </ds:schemaRefs>

</xml_diff>